<commit_message>
Correct the 8th download instructions in Getting Started
The "Where to get it" section assumed a direct download link. Corrected
per Graham: 8th is distributed by its author, Ron Aaron, via a
download/request form on https://8th-dev.com/ that emails a ZIP link,
not a direct download. Also added a caveat that download/licensing
arrangements may change, pointing readers to the current site
instructions rather than this book for account/subscription details.

Rebuilt the DOCX, re-validated, regenerated the proof PDF (docx
confirmed unmodified), spot-checked the updated page.
</commit_message>
<xml_diff>
--- a/manuscript/Thinking-8th.docx
+++ b/manuscript/Thinking-8th.docx
@@ -80,7 +80,7 @@
       <w:r>
         <w:t xml:space="preserve"> is an attempt to do for </w:t>
       </w:r>
-      <w:hyperlink w:history="1" r:id="rIdgoad5przxnxc_xpz18v9_">
+      <w:hyperlink w:history="1" r:id="rIdp2htufvzegaj2kdftsusj">
         <w:r>
           <w:rPr>
             <w:rStyle w:val="Hyperlink"/>
@@ -152,7 +152,7 @@
       <w:r>
         <w:t xml:space="preserve"> is available at </w:t>
       </w:r>
-      <w:hyperlink w:history="1" r:id="rId43yhivzows1pqhldp_nab">
+      <w:hyperlink w:history="1" r:id="rIdwumrkk022_xawmet5_rlc">
         <w:r>
           <w:rPr>
             <w:rStyle w:val="Hyperlink"/>
@@ -236,9 +236,9 @@
         <w:pStyle w:val="Normal"/>
       </w:pPr>
       <w:r>
-        <w:t xml:space="preserve">Download 8th from </w:t>
-      </w:r>
-      <w:hyperlink w:history="1" r:id="rId_jt_7bjqwea0j18npydsm">
+        <w:t xml:space="preserve">Go to </w:t>
+      </w:r>
+      <w:hyperlink w:history="1" r:id="rIdi66cwns8bkbny8yhjzb6w">
         <w:r>
           <w:rPr>
             <w:rStyle w:val="Hyperlink"/>
@@ -247,18 +247,75 @@
         </w:r>
       </w:hyperlink>
       <w:r>
-        <w:t xml:space="preserve">. Unzip the distribution wherever you like. Inside, you'll find a </w:t>
-      </w:r>
-      <w:r>
-        <w:rPr>
-          <w:rFonts w:ascii="Consolas" w:cs="Consolas" w:eastAsia="Consolas" w:hAnsi="Consolas"/>
-          <w:sz w:val="20"/>
-          <w:szCs w:val="20"/>
-        </w:rPr>
-        <w:t xml:space="preserve">bin</w:t>
-      </w:r>
-      <w:r>
-        <w:t xml:space="preserve"> folder with the executable for your platform (on Windows, for instance, </w:t>
+        <w:t xml:space="preserve">. 8th is distributed by its author, Ron Aaron: complete the download/request form on the website, and you'll be sent a link to download the appropriate ZIP archive for your platform.</w:t>
+      </w:r>
+    </w:p>
+    <w:p>
+      <w:pPr>
+        <w:pStyle w:val="Normal"/>
+      </w:pPr>
+      <w:r>
+        <w:t xml:space="preserve">Unzip the distribution wherever you like. Inside it you'll find, among other things:</w:t>
+      </w:r>
+    </w:p>
+    <w:p>
+      <w:pPr>
+        <w:pStyle w:val="ListParagraph"/>
+        <w:numPr>
+          <w:ilvl w:val="0"/>
+          <w:numId w:val="2"/>
+        </w:numPr>
+        <w:ind w:left="720" w:hanging="360"/>
+      </w:pPr>
+      <w:r>
+        <w:t xml:space="preserve">the 8th executable for your platform;</w:t>
+      </w:r>
+    </w:p>
+    <w:p>
+      <w:pPr>
+        <w:pStyle w:val="ListParagraph"/>
+        <w:numPr>
+          <w:ilvl w:val="0"/>
+          <w:numId w:val="2"/>
+        </w:numPr>
+        <w:ind w:left="720" w:hanging="360"/>
+      </w:pPr>
+      <w:r>
+        <w:t xml:space="preserve">the official documentation;</w:t>
+      </w:r>
+    </w:p>
+    <w:p>
+      <w:pPr>
+        <w:pStyle w:val="ListParagraph"/>
+        <w:numPr>
+          <w:ilvl w:val="0"/>
+          <w:numId w:val="2"/>
+        </w:numPr>
+        <w:ind w:left="720" w:hanging="360"/>
+      </w:pPr>
+      <w:r>
+        <w:t xml:space="preserve">libraries;</w:t>
+      </w:r>
+    </w:p>
+    <w:p>
+      <w:pPr>
+        <w:pStyle w:val="ListParagraph"/>
+        <w:numPr>
+          <w:ilvl w:val="0"/>
+          <w:numId w:val="2"/>
+        </w:numPr>
+        <w:ind w:left="720" w:hanging="360"/>
+      </w:pPr>
+      <w:r>
+        <w:t xml:space="preserve">sample programs.</w:t>
+      </w:r>
+    </w:p>
+    <w:p>
+      <w:pPr>
+        <w:pStyle w:val="Normal"/>
+      </w:pPr>
+      <w:r>
+        <w:t xml:space="preserve">On Windows, for example, the 64-bit executable is found under </w:t>
       </w:r>
       <w:r>
         <w:rPr>
@@ -269,37 +326,23 @@
         <w:t xml:space="preserve">bin/win64/8th.exe</w:t>
       </w:r>
       <w:r>
-        <w:t xml:space="preserve">), a </w:t>
-      </w:r>
-      <w:r>
-        <w:rPr>
-          <w:rFonts w:ascii="Consolas" w:cs="Consolas" w:eastAsia="Consolas" w:hAnsi="Consolas"/>
-          <w:sz w:val="20"/>
-          <w:szCs w:val="20"/>
-        </w:rPr>
-        <w:t xml:space="preserve">docs</w:t>
-      </w:r>
-      <w:r>
-        <w:t xml:space="preserve"> folder, and a </w:t>
-      </w:r>
-      <w:r>
-        <w:rPr>
-          <w:rFonts w:ascii="Consolas" w:cs="Consolas" w:eastAsia="Consolas" w:hAnsi="Consolas"/>
-          <w:sz w:val="20"/>
-          <w:szCs w:val="20"/>
-        </w:rPr>
-        <w:t xml:space="preserve">samples</w:t>
-      </w:r>
-      <w:r>
-        <w:t xml:space="preserve"> folder full of example programs.</w:t>
-      </w:r>
-    </w:p>
-    <w:p>
-      <w:pPr>
-        <w:pStyle w:val="Normal"/>
-      </w:pPr>
-      <w:r>
-        <w:t xml:space="preserve">That's the only thing you need to follow this book — no account, no package manager, no other tools.</w:t>
+        <w:t xml:space="preserve">.</w:t>
+      </w:r>
+    </w:p>
+    <w:p>
+      <w:pPr>
+        <w:pStyle w:val="Normal"/>
+      </w:pPr>
+      <w:r>
+        <w:t xml:space="preserve">That's the only tool you need to follow this book — no package manager, no other software to install.</w:t>
+      </w:r>
+    </w:p>
+    <w:p>
+      <w:pPr>
+        <w:pStyle w:val="Normal"/>
+      </w:pPr>
+      <w:r>
+        <w:t xml:space="preserve">The exact download and licensing arrangements may change over time, so follow the current instructions on the 8th website rather than relying on this book for account or subscription details.</w:t>
       </w:r>
     </w:p>
     <w:p>
@@ -336,7 +379,7 @@
       <w:r>
         <w:t xml:space="preserve">For instance, the very first complete program this book shows you — </w:t>
       </w:r>
-      <w:hyperlink w:history="1" r:id="rIdlvldpwogjuur2wk4bmubo">
+      <w:hyperlink w:history="1" r:id="rIdnyqqga4dhc9z_z9quq1pp">
         <w:r>
           <w:rPr>
             <w:rStyle w:val="Hyperlink"/>
@@ -2824,7 +2867,7 @@
       <w:r>
         <w:t xml:space="preserve">Running it (see </w:t>
       </w:r>
-      <w:hyperlink w:history="1" r:id="rIddryptz8n2pjcnkf-pddxt">
+      <w:hyperlink w:history="1" r:id="rId04-j3jabsjpfqfuvtjheh">
         <w:r>
           <w:rPr>
             <w:rStyle w:val="Hyperlink"/>
@@ -3734,7 +3777,7 @@
       <w:r>
         <w:t xml:space="preserve">This is </w:t>
       </w:r>
-      <w:hyperlink w:history="1" r:id="rIdi4p3huqhtxe4sa4w3yf_7">
+      <w:hyperlink w:history="1" r:id="rId7nktdg-0t5pjrrrwo1p1p">
         <w:r>
           <w:rPr>
             <w:rStyle w:val="Hyperlink"/>
@@ -5121,7 +5164,7 @@
       <w:r>
         <w:t xml:space="preserve">This is </w:t>
       </w:r>
-      <w:hyperlink w:history="1" r:id="rIdiu55c_zimdetyl2xhmjvn">
+      <w:hyperlink w:history="1" r:id="rIdbvakkgms7qwkabdr2lvyt">
         <w:r>
           <w:rPr>
             <w:rStyle w:val="Hyperlink"/>
@@ -6194,7 +6237,7 @@
       <w:pPr>
         <w:pStyle w:val="Normal"/>
       </w:pPr>
-      <w:hyperlink w:history="1" r:id="rIdw_sbgoltn9re5o2hbuudu">
+      <w:hyperlink w:history="1" r:id="rIdlb9nixyetphpy6kfqz5gq">
         <w:r>
           <w:rPr>
             <w:rStyle w:val="Hyperlink"/>
@@ -6819,7 +6862,7 @@
       <w:r>
         <w:t xml:space="preserve">This is </w:t>
       </w:r>
-      <w:hyperlink w:history="1" r:id="rIdbbkx7w7v0d4dvdl6_qyr6">
+      <w:hyperlink w:history="1" r:id="rId3e4xv3fg3uxvl5s4ycofm">
         <w:r>
           <w:rPr>
             <w:rStyle w:val="Hyperlink"/>
@@ -9394,7 +9437,7 @@
       <w:r>
         <w:t xml:space="preserve">Every one matches. This is </w:t>
       </w:r>
-      <w:hyperlink w:history="1" r:id="rId7qxlpmveuau2elyqtjfhj">
+      <w:hyperlink w:history="1" r:id="rIdceyqp7gowkyiquhcolxco">
         <w:r>
           <w:rPr>
             <w:rStyle w:val="Hyperlink"/>

</xml_diff>